<commit_message>
docs(status): registra a primeira revisão entre contas (PR #32) e a limpeza de branches
Co-Authored-By: Claude Opus 5.5 <noreply@anthropic.com>
</commit_message>
<xml_diff>
--- a/docs/STATUS_LABORATORIO.docx
+++ b/docs/STATUS_LABORATORIO.docx
@@ -34,7 +34,7 @@
         <w:pStyle w:val="BlockText"/>
       </w:pPr>
       <w:r>
-        <w:t xml:space="preserve">Última atualização: 2026-09-24. Se você (Claude Code) alterar algo relevante ao estado do laboratório,</w:t>
+        <w:t xml:space="preserve">Última atualização: 2026-09-28. Se você (Claude Code) alterar algo relevante ao estado do laboratório,</w:t>
       </w:r>
       <w:r>
         <w:t xml:space="preserve"> </w:t>
@@ -3462,6 +3462,196 @@
       </w:r>
       <w:r>
         <w:t xml:space="preserve">(público, devs com permissão de escrita, cards #27 e #29). O board antigo da conta pessoal ficou só como histórico. Remoto das 3 pastas e links da documentação atualizados.</w:t>
+      </w:r>
+    </w:p>
+    <w:p>
+      <w:pPr>
+        <w:pStyle w:val="Compact"/>
+        <w:numPr>
+          <w:ilvl w:val="0"/>
+          <w:numId w:val="1004"/>
+        </w:numPr>
+      </w:pPr>
+      <w:r>
+        <w:rPr>
+          <w:strike/>
+        </w:rPr>
+        <w:t xml:space="preserve">Primeira revisão real entre contas</w:t>
+      </w:r>
+      <w:r>
+        <w:t xml:space="preserve"> </w:t>
+      </w:r>
+      <w:r>
+        <w:t xml:space="preserve">— feito em 2026-09-28: o PR #32 (aberto por ScaTecnologia) foi</w:t>
+      </w:r>
+      <w:r>
+        <w:t xml:space="preserve"> </w:t>
+      </w:r>
+      <w:r>
+        <w:rPr>
+          <w:b/>
+          <w:bCs/>
+        </w:rPr>
+        <w:t xml:space="preserve">aprovado por sca-dev1</w:t>
+      </w:r>
+      <w:r>
+        <w:t xml:space="preserve"> </w:t>
+      </w:r>
+      <w:r>
+        <w:t xml:space="preserve">e mergeado com os checks verdes. Como aprovar: entrar como outra conta (janela anônima no navegador →</w:t>
+      </w:r>
+      <w:r>
+        <w:t xml:space="preserve"> </w:t>
+      </w:r>
+      <w:r>
+        <w:rPr>
+          <w:i/>
+          <w:iCs/>
+        </w:rPr>
+        <w:t xml:space="preserve">Files changed</w:t>
+      </w:r>
+      <w:r>
+        <w:t xml:space="preserve"> </w:t>
+      </w:r>
+      <w:r>
+        <w:t xml:space="preserve">→</w:t>
+      </w:r>
+      <w:r>
+        <w:t xml:space="preserve"> </w:t>
+      </w:r>
+      <w:r>
+        <w:rPr>
+          <w:i/>
+          <w:iCs/>
+        </w:rPr>
+        <w:t xml:space="preserve">Review changes</w:t>
+      </w:r>
+      <w:r>
+        <w:t xml:space="preserve"> </w:t>
+      </w:r>
+      <w:r>
+        <w:t xml:space="preserve">→</w:t>
+      </w:r>
+      <w:r>
+        <w:t xml:space="preserve"> </w:t>
+      </w:r>
+      <w:r>
+        <w:rPr>
+          <w:i/>
+          <w:iCs/>
+        </w:rPr>
+        <w:t xml:space="preserve">Approve</w:t>
+      </w:r>
+      <w:r>
+        <w:t xml:space="preserve">; ou</w:t>
+      </w:r>
+      <w:r>
+        <w:t xml:space="preserve"> </w:t>
+      </w:r>
+      <w:r>
+        <w:rPr>
+          <w:rStyle w:val="VerbatimChar"/>
+        </w:rPr>
+        <w:t xml:space="preserve">gh auth switch -u sca-dev1</w:t>
+      </w:r>
+      <w:r>
+        <w:t xml:space="preserve"> </w:t>
+      </w:r>
+      <w:r>
+        <w:t xml:space="preserve">+</w:t>
+      </w:r>
+      <w:r>
+        <w:t xml:space="preserve"> </w:t>
+      </w:r>
+      <w:r>
+        <w:rPr>
+          <w:rStyle w:val="VerbatimChar"/>
+        </w:rPr>
+        <w:t xml:space="preserve">gh pr review &lt;n&gt; --approve</w:t>
+      </w:r>
+      <w:r>
+        <w:t xml:space="preserve">, e depois</w:t>
+      </w:r>
+      <w:r>
+        <w:t xml:space="preserve"> </w:t>
+      </w:r>
+      <w:r>
+        <w:rPr>
+          <w:rStyle w:val="VerbatimChar"/>
+        </w:rPr>
+        <w:t xml:space="preserve">gh auth switch -u ScaTecnologia</w:t>
+      </w:r>
+      <w:r>
+        <w:t xml:space="preserve"> </w:t>
+      </w:r>
+      <w:r>
+        <w:t xml:space="preserve">para voltar). Ninguém aprova o próprio PR. Limpeza local: apagadas as branches já mergeadas</w:t>
+      </w:r>
+      <w:r>
+        <w:t xml:space="preserve"> </w:t>
+      </w:r>
+      <w:r>
+        <w:rPr>
+          <w:rStyle w:val="VerbatimChar"/>
+        </w:rPr>
+        <w:t xml:space="preserve">chore/time-com-contas-reais</w:t>
+      </w:r>
+      <w:r>
+        <w:t xml:space="preserve"> </w:t>
+      </w:r>
+      <w:r>
+        <w:t xml:space="preserve">e</w:t>
+      </w:r>
+      <w:r>
+        <w:t xml:space="preserve"> </w:t>
+      </w:r>
+      <w:r>
+        <w:rPr>
+          <w:rStyle w:val="VerbatimChar"/>
+        </w:rPr>
+        <w:t xml:space="preserve">chore/python-3.13</w:t>
+      </w:r>
+      <w:r>
+        <w:t xml:space="preserve"> </w:t>
+      </w:r>
+      <w:r>
+        <w:t xml:space="preserve">(</w:t>
+      </w:r>
+      <w:r>
+        <w:rPr>
+          <w:rStyle w:val="VerbatimChar"/>
+        </w:rPr>
+        <w:t xml:space="preserve">git branch -d</w:t>
+      </w:r>
+      <w:r>
+        <w:t xml:space="preserve"> </w:t>
+      </w:r>
+      <w:r>
+        <w:t xml:space="preserve">+</w:t>
+      </w:r>
+      <w:r>
+        <w:t xml:space="preserve"> </w:t>
+      </w:r>
+      <w:r>
+        <w:rPr>
+          <w:rStyle w:val="VerbatimChar"/>
+        </w:rPr>
+        <w:t xml:space="preserve">git fetch --prune</w:t>
+      </w:r>
+      <w:r>
+        <w:t xml:space="preserve">); hoje só existe a</w:t>
+      </w:r>
+      <w:r>
+        <w:t xml:space="preserve"> </w:t>
+      </w:r>
+      <w:r>
+        <w:rPr>
+          <w:rStyle w:val="VerbatimChar"/>
+        </w:rPr>
+        <w:t xml:space="preserve">main</w:t>
+      </w:r>
+      <w:r>
+        <w:t xml:space="preserve">.</w:t>
       </w:r>
     </w:p>
     <w:p>

</xml_diff>

<commit_message>
docs(status): registra os cards #27 e #29 concluídos e corrige privado/público
- Item 15: cards #29 (Dev 2, PR #35) e #27 (Dev 1, PR #34) feitos em
  paralelo, cada um revisado por outra conta, sem conflito.
- Item 3: o repositório foi criado privado, mas hoje é público na
  organização (a seção 1 já dizia isso).

Co-Authored-By: Claude Opus 5.5 <noreply@anthropic.com>
</commit_message>
<xml_diff>
--- a/docs/STATUS_LABORATORIO.docx
+++ b/docs/STATUS_LABORATORIO.docx
@@ -1900,7 +1900,10 @@
         <w:t xml:space="preserve"> </w:t>
       </w:r>
       <w:r>
-        <w:t xml:space="preserve">(</w:t>
+        <w:t xml:space="preserve">(criado</w:t>
+      </w:r>
+      <w:r>
+        <w:t xml:space="preserve"> </w:t>
       </w:r>
       <w:r>
         <w:rPr>
@@ -1910,7 +1913,26 @@
         <w:t xml:space="preserve">privado</w:t>
       </w:r>
       <w:r>
-        <w:t xml:space="preserve">, conta pessoal Free). Push por SSH (chave</w:t>
+        <w:t xml:space="preserve"> </w:t>
+      </w:r>
+      <w:r>
+        <w:t xml:space="preserve">na conta pessoal Free; tornado</w:t>
+      </w:r>
+      <w:r>
+        <w:t xml:space="preserve"> </w:t>
+      </w:r>
+      <w:r>
+        <w:rPr>
+          <w:b/>
+          <w:bCs/>
+        </w:rPr>
+        <w:t xml:space="preserve">público</w:t>
+      </w:r>
+      <w:r>
+        <w:t xml:space="preserve"> </w:t>
+      </w:r>
+      <w:r>
+        <w:t xml:space="preserve">no item 4 e transferido para a organização no item 17). Push por SSH (chave</w:t>
       </w:r>
       <w:r>
         <w:t xml:space="preserve"> </w:t>
@@ -3175,52 +3197,249 @@
       </w:pPr>
       <w:r>
         <w:rPr>
+          <w:strike/>
+        </w:rPr>
+        <w:t xml:space="preserve">Praticar com 2 devs em paralelo</w:t>
+      </w:r>
+      <w:r>
+        <w:t xml:space="preserve"> </w:t>
+      </w:r>
+      <w:r>
+        <w:t xml:space="preserve">— feito em 2026-09-28, cada dev na sua pasta e com a sua conta:</w:t>
+      </w:r>
+    </w:p>
+    <w:p>
+      <w:pPr>
+        <w:pStyle w:val="Compact"/>
+        <w:numPr>
+          <w:ilvl w:val="1"/>
+          <w:numId w:val="1006"/>
+        </w:numPr>
+      </w:pPr>
+      <w:r>
+        <w:rPr>
           <w:b/>
           <w:bCs/>
         </w:rPr>
-        <w:t xml:space="preserve">Para você praticar:</w:t>
-      </w:r>
-      <w:r>
-        <w:t xml:space="preserve"> </w:t>
-      </w:r>
-      <w:r>
-        <w:t xml:space="preserve">Dev 1 faz o card #27 em</w:t>
-      </w:r>
-      <w:r>
-        <w:t xml:space="preserve"> </w:t>
-      </w:r>
-      <w:r>
-        <w:rPr>
-          <w:rStyle w:val="VerbatimChar"/>
+        <w:t xml:space="preserve">#29 (Dev 2,</w:t>
+      </w:r>
+      <w:r>
+        <w:rPr>
+          <w:b/>
+          <w:bCs/>
+        </w:rPr>
+        <w:t xml:space="preserve"> </w:t>
+      </w:r>
+      <w:r>
+        <w:rPr>
+          <w:rStyle w:val="VerbatimChar"/>
+          <w:b/>
+          <w:bCs/>
+        </w:rPr>
+        <w:t xml:space="preserve">~/devs/dev2</w:t>
+      </w:r>
+      <w:r>
+        <w:rPr>
+          <w:b/>
+          <w:bCs/>
+        </w:rPr>
+        <w:t xml:space="preserve">)</w:t>
+      </w:r>
+      <w:r>
+        <w:t xml:space="preserve"> </w:t>
+      </w:r>
+      <w:r>
+        <w:t xml:space="preserve">— busca de fornecedores por nome ou CNPJ, só no navegador (</w:t>
+      </w:r>
+      <w:r>
+        <w:rPr>
+          <w:rStyle w:val="VerbatimChar"/>
+        </w:rPr>
+        <w:t xml:space="preserve">src/public/fornecedores.html</w:t>
+      </w:r>
+      <w:r>
+        <w:t xml:space="preserve"> </w:t>
+      </w:r>
+      <w:r>
+        <w:t xml:space="preserve">+</w:t>
+      </w:r>
+      <w:r>
+        <w:t xml:space="preserve"> </w:t>
+      </w:r>
+      <w:r>
+        <w:rPr>
+          <w:rStyle w:val="VerbatimChar"/>
+        </w:rPr>
+        <w:t xml:space="preserve">src/public/js/fornecedores.js</w:t>
+      </w:r>
+      <w:r>
+        <w:t xml:space="preserve">:</w:t>
+      </w:r>
+      <w:r>
+        <w:t xml:space="preserve"> </w:t>
+      </w:r>
+      <w:r>
+        <w:rPr>
+          <w:rStyle w:val="VerbatimChar"/>
+        </w:rPr>
+        <w:t xml:space="preserve">filtrar()</w:t>
+      </w:r>
+      <w:r>
+        <w:t xml:space="preserve"> </w:t>
+      </w:r>
+      <w:r>
+        <w:t xml:space="preserve">+</w:t>
+      </w:r>
+      <w:r>
+        <w:t xml:space="preserve"> </w:t>
+      </w:r>
+      <w:r>
+        <w:rPr>
+          <w:rStyle w:val="VerbatimChar"/>
+        </w:rPr>
+        <w:t xml:space="preserve">renderizar()</w:t>
+      </w:r>
+      <w:r>
+        <w:t xml:space="preserve">). PR #35 aberto por sca-dev2, aprovado por ScaTecnologia, mergeado com os checks verdes.</w:t>
+      </w:r>
+    </w:p>
+    <w:p>
+      <w:pPr>
+        <w:pStyle w:val="Compact"/>
+        <w:numPr>
+          <w:ilvl w:val="1"/>
+          <w:numId w:val="1006"/>
+        </w:numPr>
+      </w:pPr>
+      <w:r>
+        <w:rPr>
+          <w:b/>
+          <w:bCs/>
+        </w:rPr>
+        <w:t xml:space="preserve">#27 (Dev 1,</w:t>
+      </w:r>
+      <w:r>
+        <w:rPr>
+          <w:b/>
+          <w:bCs/>
+        </w:rPr>
+        <w:t xml:space="preserve"> </w:t>
+      </w:r>
+      <w:r>
+        <w:rPr>
+          <w:rStyle w:val="VerbatimChar"/>
+          <w:b/>
+          <w:bCs/>
         </w:rPr>
         <w:t xml:space="preserve">~/devs/dev1</w:t>
       </w:r>
       <w:r>
-        <w:t xml:space="preserve"> </w:t>
-      </w:r>
-      <w:r>
-        <w:t xml:space="preserve">e Dev 2 o #29 em</w:t>
-      </w:r>
-      <w:r>
-        <w:t xml:space="preserve"> </w:t>
-      </w:r>
-      <w:r>
-        <w:rPr>
-          <w:rStyle w:val="VerbatimChar"/>
-        </w:rPr>
-        <w:t xml:space="preserve">~/devs/dev2</w:t>
-      </w:r>
-      <w:r>
-        <w:t xml:space="preserve"> </w:t>
-      </w:r>
-      <w:r>
-        <w:t xml:space="preserve">(</w:t>
+        <w:rPr>
+          <w:b/>
+          <w:bCs/>
+        </w:rPr>
+        <w:t xml:space="preserve">)</w:t>
+      </w:r>
+      <w:r>
+        <w:t xml:space="preserve"> </w:t>
+      </w:r>
+      <w:r>
+        <w:t xml:space="preserve">— quantidade de clientes no título da lista (</w:t>
+      </w:r>
+      <w:r>
+        <w:rPr>
+          <w:rStyle w:val="VerbatimChar"/>
+        </w:rPr>
+        <w:t xml:space="preserve">src/public/clientes.html</w:t>
+      </w:r>
+      <w:r>
+        <w:t xml:space="preserve"> </w:t>
+      </w:r>
+      <w:r>
+        <w:t xml:space="preserve">+</w:t>
+      </w:r>
+      <w:r>
+        <w:t xml:space="preserve"> </w:t>
+      </w:r>
+      <w:r>
+        <w:rPr>
+          <w:rStyle w:val="VerbatimChar"/>
+        </w:rPr>
+        <w:t xml:space="preserve">src/public/js/clientes.js</w:t>
+      </w:r>
+      <w:r>
+        <w:t xml:space="preserve">). PR #34 aberto por sca-dev1,</w:t>
+      </w:r>
+      <w:r>
+        <w:t xml:space="preserve"> </w:t>
+      </w:r>
+      <w:r>
+        <w:rPr>
+          <w:b/>
+          <w:bCs/>
+        </w:rPr>
+        <w:t xml:space="preserve">aprovado por sca-dev2</w:t>
+      </w:r>
+      <w:r>
+        <w:t xml:space="preserve">, mergeado depois do #35.</w:t>
+      </w:r>
+    </w:p>
+    <w:p>
+      <w:pPr>
+        <w:pStyle w:val="Compact"/>
+        <w:numPr>
+          <w:ilvl w:val="1"/>
+          <w:numId w:val="1006"/>
+        </w:numPr>
+      </w:pPr>
+      <w:r>
+        <w:t xml:space="preserve">Arquivos diferentes, então</w:t>
+      </w:r>
+      <w:r>
+        <w:t xml:space="preserve"> </w:t>
+      </w:r>
+      <w:r>
+        <w:rPr>
+          <w:b/>
+          <w:bCs/>
+        </w:rPr>
+        <w:t xml:space="preserve">nenhum conflito</w:t>
+      </w:r>
+      <w:r>
+        <w:t xml:space="preserve">, como previsto em</w:t>
+      </w:r>
+      <w:r>
+        <w:t xml:space="preserve"> </w:t>
       </w:r>
       <w:r>
         <w:rPr>
           <w:rStyle w:val="VerbatimChar"/>
         </w:rPr>
         <w:t xml:space="preserve">docs/SIMULANDO_2_DEVS.md</w:t>
+      </w:r>
+      <w:r>
+        <w:t xml:space="preserve">. Branches apagadas no remoto e na pasta do Dev 2 (</w:t>
+      </w:r>
+      <w:r>
+        <w:rPr>
+          <w:rStyle w:val="VerbatimChar"/>
+        </w:rPr>
+        <w:t xml:space="preserve">git branch -d</w:t>
+      </w:r>
+      <w:r>
+        <w:t xml:space="preserve"> </w:t>
+      </w:r>
+      <w:r>
+        <w:t xml:space="preserve">+</w:t>
+      </w:r>
+      <w:r>
+        <w:t xml:space="preserve"> </w:t>
+      </w:r>
+      <w:r>
+        <w:rPr>
+          <w:rStyle w:val="VerbatimChar"/>
+        </w:rPr>
+        <w:t xml:space="preserve">git fetch --prune</w:t>
       </w:r>
       <w:r>
         <w:t xml:space="preserve">).</w:t>
@@ -4451,6 +4670,9 @@
     </w:lvlOverride>
   </w:num>
   <w:num w:numId="1005">
+    <w:abstractNumId w:val="991"/>
+  </w:num>
+  <w:num w:numId="1006">
     <w:abstractNumId w:val="991"/>
   </w:num>
 </w:numbering>

</xml_diff>

<commit_message>
docs: guia da fábrica de software, do card à produção
Novo docs/FABRICA_DE_SOFTWARE.md (+ .docx): passo a passo didático para
gerente, dev, revisor e aprovador, com tela e CLI em cada etapa;
containers de dev e produção; banco (backup/restauração testados);
tag SemVer, deploy com aprovação, rollback e hotfix.

Também: referências no CLAUDE.md e no PROJECT_CONTEXT.md; STATUS com
os itens 20 a 22 (card #37, PR #39 bloqueado pelo Trivy); o script
atualizar_docx.sh passa a gerar o .docx do guia.

Co-Authored-By: Claude Opus 5.5 <noreply@anthropic.com>
</commit_message>
<xml_diff>
--- a/docs/STATUS_LABORATORIO.docx
+++ b/docs/STATUS_LABORATORIO.docx
@@ -3893,6 +3893,330 @@
       </w:r>
       <w:r>
         <w:t xml:space="preserve">planejar Node 24 → 26 LTS depois de 2026-10-28.</w:t>
+      </w:r>
+    </w:p>
+    <w:p>
+      <w:pPr>
+        <w:pStyle w:val="Compact"/>
+        <w:numPr>
+          <w:ilvl w:val="0"/>
+          <w:numId w:val="1004"/>
+        </w:numPr>
+      </w:pPr>
+      <w:r>
+        <w:rPr>
+          <w:strike/>
+        </w:rPr>
+        <w:t xml:space="preserve">Guia da fábrica de software</w:t>
+      </w:r>
+      <w:r>
+        <w:t xml:space="preserve"> </w:t>
+      </w:r>
+      <w:r>
+        <w:t xml:space="preserve">— feito em 2026-09-29:</w:t>
+      </w:r>
+      <w:r>
+        <w:t xml:space="preserve"> </w:t>
+      </w:r>
+      <w:r>
+        <w:rPr>
+          <w:rStyle w:val="VerbatimChar"/>
+        </w:rPr>
+        <w:t xml:space="preserve">docs/FABRICA_DE_SOFTWARE.md</w:t>
+      </w:r>
+      <w:r>
+        <w:t xml:space="preserve">, o passo a passo didático do card à produção para gerente, dev, revisor e aprovador (tela e CLI em cada etapa; containers de dev e produção; backup/restauração do banco testados de verdade; tag SemVer; deploy com aprovação no Environment</w:t>
+      </w:r>
+      <w:r>
+        <w:t xml:space="preserve"> </w:t>
+      </w:r>
+      <w:r>
+        <w:rPr>
+          <w:rStyle w:val="VerbatimChar"/>
+        </w:rPr>
+        <w:t xml:space="preserve">production</w:t>
+      </w:r>
+      <w:r>
+        <w:t xml:space="preserve">; rollback por tag; hotfix). A pasta</w:t>
+      </w:r>
+      <w:r>
+        <w:t xml:space="preserve"> </w:t>
+      </w:r>
+      <w:r>
+        <w:rPr>
+          <w:rStyle w:val="VerbatimChar"/>
+        </w:rPr>
+        <w:t xml:space="preserve">~/Documentos/laboratorio-claude-code</w:t>
+      </w:r>
+      <w:r>
+        <w:t xml:space="preserve"> </w:t>
+      </w:r>
+      <w:r>
+        <w:t xml:space="preserve">(porta 3000) passa a ser tratada como</w:t>
+      </w:r>
+      <w:r>
+        <w:t xml:space="preserve"> </w:t>
+      </w:r>
+      <w:r>
+        <w:rPr>
+          <w:b/>
+          <w:bCs/>
+        </w:rPr>
+        <w:t xml:space="preserve">produção</w:t>
+      </w:r>
+      <w:r>
+        <w:t xml:space="preserve">: só roda a</w:t>
+      </w:r>
+      <w:r>
+        <w:t xml:space="preserve"> </w:t>
+      </w:r>
+      <w:r>
+        <w:rPr>
+          <w:rStyle w:val="VerbatimChar"/>
+        </w:rPr>
+        <w:t xml:space="preserve">main</w:t>
+      </w:r>
+      <w:r>
+        <w:t xml:space="preserve">. Novo card</w:t>
+      </w:r>
+      <w:r>
+        <w:t xml:space="preserve"> </w:t>
+      </w:r>
+      <w:r>
+        <w:rPr>
+          <w:b/>
+          <w:bCs/>
+        </w:rPr>
+        <w:t xml:space="preserve">#37</w:t>
+      </w:r>
+      <w:r>
+        <w:t xml:space="preserve"> </w:t>
+      </w:r>
+      <w:r>
+        <w:t xml:space="preserve">(busca de clientes, Dev 1) criado sem responsável, em</w:t>
+      </w:r>
+      <w:r>
+        <w:t xml:space="preserve"> </w:t>
+      </w:r>
+      <w:r>
+        <w:rPr>
+          <w:b/>
+          <w:bCs/>
+        </w:rPr>
+        <w:t xml:space="preserve">To Do</w:t>
+      </w:r>
+      <w:r>
+        <w:t xml:space="preserve">, como exercício do guia.</w:t>
+      </w:r>
+      <w:r>
+        <w:t xml:space="preserve"> </w:t>
+      </w:r>
+      <w:r>
+        <w:rPr>
+          <w:b/>
+          <w:bCs/>
+        </w:rPr>
+        <w:t xml:space="preserve">Atenção:</w:t>
+      </w:r>
+      <w:r>
+        <w:t xml:space="preserve"> </w:t>
+      </w:r>
+      <w:r>
+        <w:t xml:space="preserve">as automações do board não moveram #27/#29 para Concluído nem adicionaram o #37 ao board — acertados à mão; conferir</w:t>
+      </w:r>
+      <w:r>
+        <w:t xml:space="preserve"> </w:t>
+      </w:r>
+      <w:r>
+        <w:rPr>
+          <w:i/>
+          <w:iCs/>
+        </w:rPr>
+        <w:t xml:space="preserve">Projects → ⋯ → Workflows</w:t>
+      </w:r>
+      <w:r>
+        <w:t xml:space="preserve">.</w:t>
+      </w:r>
+    </w:p>
+    <w:p>
+      <w:pPr>
+        <w:pStyle w:val="Compact"/>
+        <w:numPr>
+          <w:ilvl w:val="0"/>
+          <w:numId w:val="1004"/>
+        </w:numPr>
+      </w:pPr>
+      <w:r>
+        <w:rPr>
+          <w:b/>
+          <w:bCs/>
+        </w:rPr>
+        <w:t xml:space="preserve">Em andamento (2026-10-05):</w:t>
+      </w:r>
+      <w:r>
+        <w:t xml:space="preserve"> </w:t>
+      </w:r>
+      <w:r>
+        <w:t xml:space="preserve">card #37 feito pelo Dev 1 (branch criada em outra máquina, trazida para</w:t>
+      </w:r>
+      <w:r>
+        <w:t xml:space="preserve"> </w:t>
+      </w:r>
+      <w:r>
+        <w:rPr>
+          <w:rStyle w:val="VerbatimChar"/>
+        </w:rPr>
+        <w:t xml:space="preserve">~/devs/dev1</w:t>
+      </w:r>
+      <w:r>
+        <w:t xml:space="preserve">). O 1º commit saiu com o e-mail de autor errado (ID de uma conta de terceiro) e foi corrigido com</w:t>
+      </w:r>
+      <w:r>
+        <w:t xml:space="preserve"> </w:t>
+      </w:r>
+      <w:r>
+        <w:rPr>
+          <w:rStyle w:val="VerbatimChar"/>
+        </w:rPr>
+        <w:t xml:space="preserve">--amend --reset-author</w:t>
+      </w:r>
+      <w:r>
+        <w:t xml:space="preserve">; a revisão local achou 3 critérios de aceite não cumpridos, corrigidos num 2º commit.</w:t>
+      </w:r>
+      <w:r>
+        <w:t xml:space="preserve"> </w:t>
+      </w:r>
+      <w:r>
+        <w:rPr>
+          <w:b/>
+          <w:bCs/>
+        </w:rPr>
+        <w:t xml:space="preserve">PR #39 aprovado, mas bloqueado</w:t>
+      </w:r>
+      <w:r>
+        <w:t xml:space="preserve"> </w:t>
+      </w:r>
+      <w:r>
+        <w:t xml:space="preserve">pelo scan Trivy da imagem Python (CVE-2026-103111 na</w:t>
+      </w:r>
+      <w:r>
+        <w:t xml:space="preserve"> </w:t>
+      </w:r>
+      <w:r>
+        <w:rPr>
+          <w:rStyle w:val="VerbatimChar"/>
+        </w:rPr>
+        <w:t xml:space="preserve">libpcre2</w:t>
+      </w:r>
+      <w:r>
+        <w:t xml:space="preserve">, da imagem base, não do PR), o que afeta todos os PRs. Correção em card de Bug próprio (Dev 2,</w:t>
+      </w:r>
+      <w:r>
+        <w:t xml:space="preserve"> </w:t>
+      </w:r>
+      <w:r>
+        <w:rPr>
+          <w:rStyle w:val="VerbatimChar"/>
+        </w:rPr>
+        <w:t xml:space="preserve">Dockerfile.python</w:t>
+      </w:r>
+      <w:r>
+        <w:t xml:space="preserve">); depois do merge dela, rodar de novo os checks do #39 e fazer o merge.</w:t>
+      </w:r>
+      <w:r>
+        <w:t xml:space="preserve"> </w:t>
+      </w:r>
+      <w:r>
+        <w:rPr>
+          <w:b/>
+          <w:bCs/>
+        </w:rPr>
+        <w:t xml:space="preserve">Na outra máquina:</w:t>
+      </w:r>
+      <w:r>
+        <w:t xml:space="preserve"> </w:t>
+      </w:r>
+      <w:r>
+        <w:t xml:space="preserve">corrigir</w:t>
+      </w:r>
+      <w:r>
+        <w:t xml:space="preserve"> </w:t>
+      </w:r>
+      <w:r>
+        <w:rPr>
+          <w:rStyle w:val="VerbatimChar"/>
+        </w:rPr>
+        <w:t xml:space="preserve">git config user.email</w:t>
+      </w:r>
+      <w:r>
+        <w:t xml:space="preserve"> </w:t>
+      </w:r>
+      <w:r>
+        <w:t xml:space="preserve">da pasta do Dev 1 para</w:t>
+      </w:r>
+      <w:r>
+        <w:t xml:space="preserve"> </w:t>
+      </w:r>
+      <w:r>
+        <w:rPr>
+          <w:rStyle w:val="VerbatimChar"/>
+        </w:rPr>
+        <w:t xml:space="preserve">333777540+sca-dev1@users.noreply.github.com</w:t>
+      </w:r>
+      <w:r>
+        <w:t xml:space="preserve">.</w:t>
+      </w:r>
+    </w:p>
+    <w:p>
+      <w:pPr>
+        <w:pStyle w:val="Compact"/>
+        <w:numPr>
+          <w:ilvl w:val="0"/>
+          <w:numId w:val="1004"/>
+        </w:numPr>
+      </w:pPr>
+      <w:r>
+        <w:rPr>
+          <w:b/>
+          <w:bCs/>
+        </w:rPr>
+        <w:t xml:space="preserve">Para você praticar:</w:t>
+      </w:r>
+      <w:r>
+        <w:t xml:space="preserve"> </w:t>
+      </w:r>
+      <w:r>
+        <w:t xml:space="preserve">depois do #37, as Etapas 14 a 16 do guia: tag</w:t>
+      </w:r>
+      <w:r>
+        <w:t xml:space="preserve"> </w:t>
+      </w:r>
+      <w:r>
+        <w:rPr>
+          <w:rStyle w:val="VerbatimChar"/>
+        </w:rPr>
+        <w:t xml:space="preserve">v1.0.0</w:t>
+      </w:r>
+      <w:r>
+        <w:t xml:space="preserve"> </w:t>
+      </w:r>
+      <w:r>
+        <w:t xml:space="preserve">do estado atual de produção,</w:t>
+      </w:r>
+      <w:r>
+        <w:t xml:space="preserve"> </w:t>
+      </w:r>
+      <w:r>
+        <w:rPr>
+          <w:rStyle w:val="VerbatimChar"/>
+        </w:rPr>
+        <w:t xml:space="preserve">v1.1.0</w:t>
+      </w:r>
+      <w:r>
+        <w:t xml:space="preserve"> </w:t>
+      </w:r>
+      <w:r>
+        <w:t xml:space="preserve">com o #37, deploy com aprovação e rollback.</w:t>
       </w:r>
     </w:p>
     <w:p>

</xml_diff>

<commit_message>
docs(status): histórico de deploys da producao validado de ponta a ponta
Co-Authored-By: Claude Sonnet 5.5 <noreply@anthropic.com>
</commit_message>
<xml_diff>
--- a/docs/STATUS_LABORATORIO.docx
+++ b/docs/STATUS_LABORATORIO.docx
@@ -4268,14 +4268,21 @@
         </w:numPr>
       </w:pPr>
       <w:r>
+        <w:rPr>
+          <w:strike/>
+        </w:rPr>
         <w:t xml:space="preserve">Histórico de deploys na branch</w:t>
       </w:r>
       <w:r>
-        <w:t xml:space="preserve"> </w:t>
-      </w:r>
-      <w:r>
-        <w:rPr>
-          <w:rStyle w:val="VerbatimChar"/>
+        <w:rPr>
+          <w:strike/>
+        </w:rPr>
+        <w:t xml:space="preserve"> </w:t>
+      </w:r>
+      <w:r>
+        <w:rPr>
+          <w:rStyle w:val="VerbatimChar"/>
+          <w:strike/>
         </w:rPr>
         <w:t xml:space="preserve">producao</w:t>
       </w:r>
@@ -4283,7 +4290,7 @@
         <w:t xml:space="preserve"> </w:t>
       </w:r>
       <w:r>
-        <w:t xml:space="preserve">(código pronto, falta o merge) — o job</w:t>
+        <w:t xml:space="preserve">— feito e validado em 2026-10-30. O job</w:t>
       </w:r>
       <w:r>
         <w:t xml:space="preserve"> </w:t>
@@ -4352,7 +4359,7 @@
         <w:t xml:space="preserve"> </w:t>
       </w:r>
       <w:r>
-        <w:t xml:space="preserve">lista os deploys. Testado localmente: deploy normal, rollback, primeiro deploy sem branch e dois deploys em paralelo (o segundo é recusado).</w:t>
+        <w:t xml:space="preserve">lista os deploys. Testado localmente (deploy normal, rollback, primeiro deploy sem branch, dois deploys em paralelo) e</w:t>
       </w:r>
       <w:r>
         <w:t xml:space="preserve"> </w:t>
@@ -4362,22 +4369,97 @@
           <w:b/>
           <w:bCs/>
         </w:rPr>
-        <w:t xml:space="preserve">PR #49</w:t>
-      </w:r>
-      <w:r>
-        <w:t xml:space="preserve"> </w:t>
-      </w:r>
-      <w:r>
-        <w:t xml:space="preserve">(</w:t>
-      </w:r>
-      <w:r>
-        <w:rPr>
-          <w:rStyle w:val="VerbatimChar"/>
-        </w:rPr>
-        <w:t xml:space="preserve">fix/historico-deploys</w:t>
-      </w:r>
-      <w:r>
-        <w:t xml:space="preserve">) aberto, aguardando aprovação de outra conta; depois de mergeado, rodar um deploy real para confirmar o histórico no GitHub.</w:t>
+        <w:t xml:space="preserve">de verdade no GitHub</w:t>
+      </w:r>
+      <w:r>
+        <w:t xml:space="preserve">: PR #49 aprovado por sca-dev1 e mergeado (</w:t>
+      </w:r>
+      <w:r>
+        <w:rPr>
+          <w:rStyle w:val="VerbatimChar"/>
+        </w:rPr>
+        <w:t xml:space="preserve">cd7273c</w:t>
+      </w:r>
+      <w:r>
+        <w:t xml:space="preserve">); deploy manual aprovado no Environment</w:t>
+      </w:r>
+      <w:r>
+        <w:t xml:space="preserve"> </w:t>
+      </w:r>
+      <w:r>
+        <w:rPr>
+          <w:rStyle w:val="VerbatimChar"/>
+        </w:rPr>
+        <w:t xml:space="preserve">production</w:t>
+      </w:r>
+      <w:r>
+        <w:t xml:space="preserve"> </w:t>
+      </w:r>
+      <w:r>
+        <w:t xml:space="preserve">gravou o commit</w:t>
+      </w:r>
+      <w:r>
+        <w:t xml:space="preserve"> </w:t>
+      </w:r>
+      <w:r>
+        <w:rPr>
+          <w:rStyle w:val="VerbatimChar"/>
+        </w:rPr>
+        <w:t xml:space="preserve">907102e</w:t>
+      </w:r>
+      <w:r>
+        <w:t xml:space="preserve"> </w:t>
+      </w:r>
+      <w:r>
+        <w:t xml:space="preserve">("produção na versão cd7273c") em cima do</w:t>
+      </w:r>
+      <w:r>
+        <w:t xml:space="preserve"> </w:t>
+      </w:r>
+      <w:r>
+        <w:rPr>
+          <w:rStyle w:val="VerbatimChar"/>
+        </w:rPr>
+        <w:t xml:space="preserve">bc63900</w:t>
+      </w:r>
+      <w:r>
+        <w:t xml:space="preserve">, e o Argo CD ficou</w:t>
+      </w:r>
+      <w:r>
+        <w:t xml:space="preserve"> </w:t>
+      </w:r>
+      <w:r>
+        <w:rPr>
+          <w:rStyle w:val="VerbatimChar"/>
+        </w:rPr>
+        <w:t xml:space="preserve">Synced</w:t>
+      </w:r>
+      <w:r>
+        <w:t xml:space="preserve">/</w:t>
+      </w:r>
+      <w:r>
+        <w:rPr>
+          <w:rStyle w:val="VerbatimChar"/>
+        </w:rPr>
+        <w:t xml:space="preserve">Healthy</w:t>
+      </w:r>
+      <w:r>
+        <w:t xml:space="preserve"> </w:t>
+      </w:r>
+      <w:r>
+        <w:t xml:space="preserve">com as 3 imagens na tag</w:t>
+      </w:r>
+      <w:r>
+        <w:t xml:space="preserve"> </w:t>
+      </w:r>
+      <w:r>
+        <w:rPr>
+          <w:rStyle w:val="VerbatimChar"/>
+        </w:rPr>
+        <w:t xml:space="preserve">cd7273c</w:t>
+      </w:r>
+      <w:r>
+        <w:t xml:space="preserve">.</w:t>
       </w:r>
     </w:p>
     <w:p>
@@ -4399,7 +4481,7 @@
         <w:t xml:space="preserve"> </w:t>
       </w:r>
       <w:r>
-        <w:t xml:space="preserve">PRs aguardando aprovação — #49 (histórico de deploys), #39 (busca de clientes), #40 (guia da fábrica de software; também altera este arquivo, espere conflito simples) e os do Dependabot #38, #43, #44, #46 (patches/minor de flake8, globals, pg, eslint). #38 e #39 podem precisar de</w:t>
+        <w:t xml:space="preserve">PRs aguardando aprovação — #39 (busca de clientes), #40 (guia da fábrica de software; também altera este arquivo, espere conflito simples) e os do Dependabot #38, #43, #44, #46 (patches/minor de flake8, globals, pg, eslint). #38 e #39 podem precisar de</w:t>
       </w:r>
       <w:r>
         <w:t xml:space="preserve"> </w:t>

</xml_diff>

<commit_message>
feat(painel): Painel de Aprendizado (containers, Kubernetes, console SQL) e Swagger completo
- painel/ (porta 3100, fora dos containers): telas de Containers, Kubernetes e
  Console SQL com textos explicativos; travas de Host/Origin/X-Painel, nomes
  validados e execFile sem shell; SQL em modo leitura/simular/gravar.
- swagger.json cobre todas as rotas (36 caminhos) com passo a passo de login.
- lint cobre painel/, lib.test.js entra no test:unit; docs atualizados.

Co-Authored-By: Claude Sonnet 5.5 <noreply@anthropic.com>
</commit_message>
<xml_diff>
--- a/docs/STATUS_LABORATORIO.docx
+++ b/docs/STATUS_LABORATORIO.docx
@@ -1922,7 +1922,6 @@
     </w:p>
     <w:p>
       <w:pPr>
-        <w:pStyle w:val="Compact"/>
         <w:numPr>
           <w:ilvl w:val="0"/>
           <w:numId w:val="1004"/>
@@ -1956,7 +1955,6 @@
     </w:p>
     <w:p>
       <w:pPr>
-        <w:pStyle w:val="Compact"/>
         <w:numPr>
           <w:ilvl w:val="0"/>
           <w:numId w:val="1004"/>
@@ -2004,7 +2002,6 @@
     </w:p>
     <w:p>
       <w:pPr>
-        <w:pStyle w:val="Compact"/>
         <w:numPr>
           <w:ilvl w:val="0"/>
           <w:numId w:val="1004"/>
@@ -2109,7 +2106,6 @@
     </w:p>
     <w:p>
       <w:pPr>
-        <w:pStyle w:val="Compact"/>
         <w:numPr>
           <w:ilvl w:val="0"/>
           <w:numId w:val="1004"/>
@@ -2362,7 +2358,6 @@
     </w:p>
     <w:p>
       <w:pPr>
-        <w:pStyle w:val="Compact"/>
         <w:numPr>
           <w:ilvl w:val="0"/>
           <w:numId w:val="1004"/>
@@ -2416,7 +2411,6 @@
     </w:p>
     <w:p>
       <w:pPr>
-        <w:pStyle w:val="Compact"/>
         <w:numPr>
           <w:ilvl w:val="0"/>
           <w:numId w:val="1004"/>
@@ -2491,7 +2485,6 @@
     </w:p>
     <w:p>
       <w:pPr>
-        <w:pStyle w:val="Compact"/>
         <w:numPr>
           <w:ilvl w:val="0"/>
           <w:numId w:val="1004"/>
@@ -2562,7 +2555,6 @@
     </w:p>
     <w:p>
       <w:pPr>
-        <w:pStyle w:val="Compact"/>
         <w:numPr>
           <w:ilvl w:val="0"/>
           <w:numId w:val="1004"/>
@@ -2736,7 +2728,6 @@
     </w:p>
     <w:p>
       <w:pPr>
-        <w:pStyle w:val="Compact"/>
         <w:numPr>
           <w:ilvl w:val="0"/>
           <w:numId w:val="1004"/>
@@ -2816,7 +2807,6 @@
     </w:p>
     <w:p>
       <w:pPr>
-        <w:pStyle w:val="Compact"/>
         <w:numPr>
           <w:ilvl w:val="0"/>
           <w:numId w:val="1004"/>
@@ -2876,7 +2866,6 @@
     </w:p>
     <w:p>
       <w:pPr>
-        <w:pStyle w:val="Compact"/>
         <w:numPr>
           <w:ilvl w:val="0"/>
           <w:numId w:val="1004"/>
@@ -2997,7 +2986,6 @@
     </w:p>
     <w:p>
       <w:pPr>
-        <w:pStyle w:val="Compact"/>
         <w:numPr>
           <w:ilvl w:val="0"/>
           <w:numId w:val="1004"/>
@@ -3097,7 +3085,6 @@
     </w:p>
     <w:p>
       <w:pPr>
-        <w:pStyle w:val="Compact"/>
         <w:numPr>
           <w:ilvl w:val="0"/>
           <w:numId w:val="1004"/>
@@ -3220,7 +3207,6 @@
     </w:p>
     <w:p>
       <w:pPr>
-        <w:pStyle w:val="Compact"/>
         <w:numPr>
           <w:ilvl w:val="0"/>
           <w:numId w:val="1004"/>
@@ -3349,7 +3335,6 @@
     </w:p>
     <w:p>
       <w:pPr>
-        <w:pStyle w:val="Compact"/>
         <w:numPr>
           <w:ilvl w:val="0"/>
           <w:numId w:val="1004"/>
@@ -3607,7 +3592,6 @@
     </w:p>
     <w:p>
       <w:pPr>
-        <w:pStyle w:val="Compact"/>
         <w:numPr>
           <w:ilvl w:val="0"/>
           <w:numId w:val="1004"/>
@@ -3763,7 +3747,6 @@
     </w:p>
     <w:p>
       <w:pPr>
-        <w:pStyle w:val="Compact"/>
         <w:numPr>
           <w:ilvl w:val="0"/>
           <w:numId w:val="1004"/>
@@ -3845,7 +3828,6 @@
     </w:p>
     <w:p>
       <w:pPr>
-        <w:pStyle w:val="Compact"/>
         <w:numPr>
           <w:ilvl w:val="0"/>
           <w:numId w:val="1004"/>
@@ -4035,7 +4017,6 @@
     </w:p>
     <w:p>
       <w:pPr>
-        <w:pStyle w:val="Compact"/>
         <w:numPr>
           <w:ilvl w:val="0"/>
           <w:numId w:val="1004"/>
@@ -4057,7 +4038,6 @@
     </w:p>
     <w:p>
       <w:pPr>
-        <w:pStyle w:val="Compact"/>
         <w:numPr>
           <w:ilvl w:val="0"/>
           <w:numId w:val="1004"/>
@@ -4180,7 +4160,6 @@
     </w:p>
     <w:p>
       <w:pPr>
-        <w:pStyle w:val="Compact"/>
         <w:numPr>
           <w:ilvl w:val="0"/>
           <w:numId w:val="1004"/>
@@ -4261,7 +4240,6 @@
     </w:p>
     <w:p>
       <w:pPr>
-        <w:pStyle w:val="Compact"/>
         <w:numPr>
           <w:ilvl w:val="0"/>
           <w:numId w:val="1004"/>
@@ -4464,7 +4442,6 @@
     </w:p>
     <w:p>
       <w:pPr>
-        <w:pStyle w:val="Compact"/>
         <w:numPr>
           <w:ilvl w:val="0"/>
           <w:numId w:val="1004"/>
@@ -4486,7 +4463,6 @@
     </w:p>
     <w:p>
       <w:pPr>
-        <w:pStyle w:val="Compact"/>
         <w:numPr>
           <w:ilvl w:val="0"/>
           <w:numId w:val="1004"/>
@@ -4629,7 +4605,6 @@
     </w:p>
     <w:p>
       <w:pPr>
-        <w:pStyle w:val="Compact"/>
         <w:numPr>
           <w:ilvl w:val="0"/>
           <w:numId w:val="1004"/>
@@ -4757,7 +4732,6 @@
     </w:p>
     <w:p>
       <w:pPr>
-        <w:pStyle w:val="Compact"/>
         <w:numPr>
           <w:ilvl w:val="0"/>
           <w:numId w:val="1004"/>
@@ -4805,6 +4779,146 @@
       </w:r>
       <w:r>
         <w:t xml:space="preserve">com o #37, deploy com aprovação e rollback.</w:t>
+      </w:r>
+    </w:p>
+    <w:p>
+      <w:pPr>
+        <w:numPr>
+          <w:ilvl w:val="0"/>
+          <w:numId w:val="1004"/>
+        </w:numPr>
+      </w:pPr>
+      <w:r>
+        <w:rPr>
+          <w:b/>
+          <w:bCs/>
+        </w:rPr>
+        <w:t xml:space="preserve">Painel de Aprendizado + Swagger completo</w:t>
+      </w:r>
+      <w:r>
+        <w:t xml:space="preserve"> </w:t>
+      </w:r>
+      <w:r>
+        <w:t xml:space="preserve">(2026-10-30, branch</w:t>
+      </w:r>
+      <w:r>
+        <w:t xml:space="preserve"> </w:t>
+      </w:r>
+      <w:r>
+        <w:rPr>
+          <w:rStyle w:val="VerbatimChar"/>
+        </w:rPr>
+        <w:t xml:space="preserve">feat/painel-aprendizado</w:t>
+      </w:r>
+      <w:r>
+        <w:t xml:space="preserve">,</w:t>
+      </w:r>
+      <w:r>
+        <w:t xml:space="preserve"> </w:t>
+      </w:r>
+      <w:r>
+        <w:rPr>
+          <w:b/>
+          <w:bCs/>
+        </w:rPr>
+        <w:t xml:space="preserve">ainda sem commit/PR</w:t>
+      </w:r>
+      <w:r>
+        <w:t xml:space="preserve">):</w:t>
+      </w:r>
+      <w:r>
+        <w:t xml:space="preserve"> </w:t>
+      </w:r>
+      <w:r>
+        <w:rPr>
+          <w:rStyle w:val="VerbatimChar"/>
+        </w:rPr>
+        <w:t xml:space="preserve">npm run painel</w:t>
+      </w:r>
+      <w:r>
+        <w:t xml:space="preserve"> </w:t>
+      </w:r>
+      <w:r>
+        <w:t xml:space="preserve">→ http://localhost:3100 com telas de Containers, Kubernetes e Console SQL (modos leitura/simular/gravar), cada uma explicando o que mostra;</w:t>
+      </w:r>
+      <w:r>
+        <w:t xml:space="preserve"> </w:t>
+      </w:r>
+      <w:r>
+        <w:rPr>
+          <w:rStyle w:val="VerbatimChar"/>
+        </w:rPr>
+        <w:t xml:space="preserve">swagger.json</w:t>
+      </w:r>
+      <w:r>
+        <w:t xml:space="preserve"> </w:t>
+      </w:r>
+      <w:r>
+        <w:t xml:space="preserve">cobre todas as rotas. Guia:</w:t>
+      </w:r>
+      <w:r>
+        <w:t xml:space="preserve"> </w:t>
+      </w:r>
+      <w:r>
+        <w:rPr>
+          <w:rStyle w:val="VerbatimChar"/>
+        </w:rPr>
+        <w:t xml:space="preserve">docs/PAINEL_APRENDIZADO.md</w:t>
+      </w:r>
+      <w:r>
+        <w:t xml:space="preserve">. Testado de verdade: API do painel contra Docker, k3d (nós, pods, HPA, eventos, logs) e um Postgres descartável (modos SQL, burla</w:t>
+      </w:r>
+      <w:r>
+        <w:t xml:space="preserve"> </w:t>
+      </w:r>
+      <w:r>
+        <w:rPr>
+          <w:rStyle w:val="VerbatimChar"/>
+        </w:rPr>
+        <w:t xml:space="preserve">COMMIT; DROP</w:t>
+      </w:r>
+      <w:r>
+        <w:t xml:space="preserve">,</w:t>
+      </w:r>
+      <w:r>
+        <w:t xml:space="preserve"> </w:t>
+      </w:r>
+      <w:r>
+        <w:rPr>
+          <w:rStyle w:val="VerbatimChar"/>
+        </w:rPr>
+        <w:t xml:space="preserve">COPY</w:t>
+      </w:r>
+      <w:r>
+        <w:t xml:space="preserve"> </w:t>
+      </w:r>
+      <w:r>
+        <w:t xml:space="preserve">bloqueado, timeout); rotas novas do Swagger exercitadas contra o backend.</w:t>
+      </w:r>
+      <w:r>
+        <w:t xml:space="preserve"> </w:t>
+      </w:r>
+      <w:r>
+        <w:rPr>
+          <w:b/>
+          <w:bCs/>
+        </w:rPr>
+        <w:t xml:space="preserve">Pendente:</w:t>
+      </w:r>
+      <w:r>
+        <w:t xml:space="preserve"> </w:t>
+      </w:r>
+      <w:r>
+        <w:t xml:space="preserve">conferir as 4 telas no navegador (a extensão do Chrome estava desconectada), commit e PR, e rebuildar a imagem do frontend (</w:t>
+      </w:r>
+      <w:r>
+        <w:rPr>
+          <w:rStyle w:val="VerbatimChar"/>
+        </w:rPr>
+        <w:t xml:space="preserve">sh scripts/k8s/dev-deploy.sh frontend</w:t>
+      </w:r>
+      <w:r>
+        <w:t xml:space="preserve">) para o novo Swagger aparecer no cluster.</w:t>
       </w:r>
     </w:p>
     <w:p>

</xml_diff>

<commit_message>
docs(status): painel de aprendizado e Swagger completo em produção
Co-Authored-By: Claude Sonnet 5.5 <noreply@anthropic.com>
</commit_message>
<xml_diff>
--- a/docs/STATUS_LABORATORIO.docx
+++ b/docs/STATUS_LABORATORIO.docx
@@ -4790,28 +4790,205 @@
       </w:pPr>
       <w:r>
         <w:rPr>
+          <w:strike/>
+        </w:rPr>
+        <w:t xml:space="preserve">Painel de Aprendizado + Swagger completo</w:t>
+      </w:r>
+      <w:r>
+        <w:t xml:space="preserve"> </w:t>
+      </w:r>
+      <w:r>
+        <w:t xml:space="preserve">— feito e em produção em 2026-10-30:</w:t>
+      </w:r>
+      <w:r>
+        <w:t xml:space="preserve"> </w:t>
+      </w:r>
+      <w:r>
+        <w:rPr>
+          <w:rStyle w:val="VerbatimChar"/>
+        </w:rPr>
+        <w:t xml:space="preserve">npm run painel</w:t>
+      </w:r>
+      <w:r>
+        <w:t xml:space="preserve"> </w:t>
+      </w:r>
+      <w:r>
+        <w:t xml:space="preserve">→ http://localhost:3100 com telas de Containers, Kubernetes e Console SQL (modos leitura/simular/gravar), cada uma explicando o que mostra (guia:</w:t>
+      </w:r>
+      <w:r>
+        <w:t xml:space="preserve"> </w:t>
+      </w:r>
+      <w:r>
+        <w:rPr>
+          <w:rStyle w:val="VerbatimChar"/>
+        </w:rPr>
+        <w:t xml:space="preserve">docs/PAINEL_APRENDIZADO.md</w:t>
+      </w:r>
+      <w:r>
+        <w:t xml:space="preserve">);</w:t>
+      </w:r>
+      <w:r>
+        <w:t xml:space="preserve"> </w:t>
+      </w:r>
+      <w:r>
+        <w:rPr>
+          <w:rStyle w:val="VerbatimChar"/>
+        </w:rPr>
+        <w:t xml:space="preserve">swagger.json</w:t>
+      </w:r>
+      <w:r>
+        <w:t xml:space="preserve"> </w:t>
+      </w:r>
+      <w:r>
+        <w:t xml:space="preserve">cobre todas as rotas (36 caminhos). PR #51 aprovado por sca-dev1 e mergeado (</w:t>
+      </w:r>
+      <w:r>
+        <w:rPr>
+          <w:rStyle w:val="VerbatimChar"/>
+        </w:rPr>
+        <w:t xml:space="preserve">4588d35</w:t>
+      </w:r>
+      <w:r>
+        <w:t xml:space="preserve">); deploy aprovado gravou o commit</w:t>
+      </w:r>
+      <w:r>
+        <w:t xml:space="preserve"> </w:t>
+      </w:r>
+      <w:r>
+        <w:rPr>
+          <w:rStyle w:val="VerbatimChar"/>
+        </w:rPr>
+        <w:t xml:space="preserve">92aa71a</w:t>
+      </w:r>
+      <w:r>
+        <w:t xml:space="preserve"> </w:t>
+      </w:r>
+      <w:r>
+        <w:t xml:space="preserve">na</w:t>
+      </w:r>
+      <w:r>
+        <w:t xml:space="preserve"> </w:t>
+      </w:r>
+      <w:r>
+        <w:rPr>
+          <w:rStyle w:val="VerbatimChar"/>
+        </w:rPr>
+        <w:t xml:space="preserve">producao</w:t>
+      </w:r>
+      <w:r>
+        <w:t xml:space="preserve"> </w:t>
+      </w:r>
+      <w:r>
+        <w:t xml:space="preserve">e o Argo CD ficou</w:t>
+      </w:r>
+      <w:r>
+        <w:t xml:space="preserve"> </w:t>
+      </w:r>
+      <w:r>
+        <w:rPr>
+          <w:rStyle w:val="VerbatimChar"/>
+        </w:rPr>
+        <w:t xml:space="preserve">Synced</w:t>
+      </w:r>
+      <w:r>
+        <w:t xml:space="preserve">/</w:t>
+      </w:r>
+      <w:r>
+        <w:rPr>
+          <w:rStyle w:val="VerbatimChar"/>
+        </w:rPr>
+        <w:t xml:space="preserve">Healthy</w:t>
+      </w:r>
+      <w:r>
+        <w:t xml:space="preserve"> </w:t>
+      </w:r>
+      <w:r>
+        <w:t xml:space="preserve">com as 3 imagens na tag</w:t>
+      </w:r>
+      <w:r>
+        <w:t xml:space="preserve"> </w:t>
+      </w:r>
+      <w:r>
+        <w:rPr>
+          <w:rStyle w:val="VerbatimChar"/>
+        </w:rPr>
+        <w:t xml:space="preserve">4588d35</w:t>
+      </w:r>
+      <w:r>
+        <w:t xml:space="preserve"> </w:t>
+      </w:r>
+      <w:r>
+        <w:t xml:space="preserve">(a produção em :8080 e o dev em :8081 já servem o Swagger novo). O CodeQL acusou</w:t>
+      </w:r>
+      <w:r>
+        <w:t xml:space="preserve"> </w:t>
+      </w:r>
+      <w:r>
+        <w:rPr>
+          <w:rStyle w:val="VerbatimChar"/>
+        </w:rPr>
+        <w:t xml:space="preserve">js/sql-injection</w:t>
+      </w:r>
+      <w:r>
+        <w:t xml:space="preserve"> </w:t>
+      </w:r>
+      <w:r>
+        <w:t xml:space="preserve">(alerta #12, alto) na linha que executa o SQL digitado no Console SQL; foi</w:t>
+      </w:r>
+      <w:r>
+        <w:t xml:space="preserve"> </w:t>
+      </w:r>
+      <w:r>
+        <w:rPr>
           <w:b/>
           <w:bCs/>
         </w:rPr>
-        <w:t xml:space="preserve">Painel de Aprendizado + Swagger completo</w:t>
-      </w:r>
-      <w:r>
-        <w:t xml:space="preserve"> </w:t>
-      </w:r>
-      <w:r>
-        <w:t xml:space="preserve">(2026-10-30, branch</w:t>
-      </w:r>
-      <w:r>
-        <w:t xml:space="preserve"> </w:t>
-      </w:r>
-      <w:r>
-        <w:rPr>
-          <w:rStyle w:val="VerbatimChar"/>
-        </w:rPr>
-        <w:t xml:space="preserve">feat/painel-aprendizado</w:t>
+        <w:t xml:space="preserve">dispensado como "won't fix" com justificativa</w:t>
+      </w:r>
+      <w:r>
+        <w:t xml:space="preserve"> </w:t>
+      </w:r>
+      <w:r>
+        <w:t xml:space="preserve">(rodar SQL do usuário é a função; mitigado por 127.0.0.1 + Host/Origin/</w:t>
+      </w:r>
+      <w:r>
+        <w:rPr>
+          <w:rStyle w:val="VerbatimChar"/>
+        </w:rPr>
+        <w:t xml:space="preserve">X-Painel</w:t>
       </w:r>
       <w:r>
         <w:t xml:space="preserve">,</w:t>
+      </w:r>
+      <w:r>
+        <w:t xml:space="preserve"> </w:t>
+      </w:r>
+      <w:r>
+        <w:rPr>
+          <w:rStyle w:val="VerbatimChar"/>
+        </w:rPr>
+        <w:t xml:space="preserve">BEGIN READ ONLY</w:t>
+      </w:r>
+      <w:r>
+        <w:t xml:space="preserve"> </w:t>
+      </w:r>
+      <w:r>
+        <w:t xml:space="preserve">por padrão, uma instrução por vez, timeout,</w:t>
+      </w:r>
+      <w:r>
+        <w:t xml:space="preserve"> </w:t>
+      </w:r>
+      <w:r>
+        <w:rPr>
+          <w:rStyle w:val="VerbatimChar"/>
+        </w:rPr>
+        <w:t xml:space="preserve">COPY</w:t>
+      </w:r>
+      <w:r>
+        <w:t xml:space="preserve"> </w:t>
+      </w:r>
+      <w:r>
+        <w:t xml:space="preserve">bloqueado). Testado de verdade: API do painel contra Docker, k3d e Postgres descartável; rotas novas do Swagger contra o backend.</w:t>
       </w:r>
       <w:r>
         <w:t xml:space="preserve"> </w:t>
@@ -4821,104 +4998,13 @@
           <w:b/>
           <w:bCs/>
         </w:rPr>
-        <w:t xml:space="preserve">ainda sem commit/PR</w:t>
-      </w:r>
-      <w:r>
-        <w:t xml:space="preserve">):</w:t>
-      </w:r>
-      <w:r>
-        <w:t xml:space="preserve"> </w:t>
-      </w:r>
-      <w:r>
-        <w:rPr>
-          <w:rStyle w:val="VerbatimChar"/>
-        </w:rPr>
-        <w:t xml:space="preserve">npm run painel</w:t>
-      </w:r>
-      <w:r>
-        <w:t xml:space="preserve"> </w:t>
-      </w:r>
-      <w:r>
-        <w:t xml:space="preserve">→ http://localhost:3100 com telas de Containers, Kubernetes e Console SQL (modos leitura/simular/gravar), cada uma explicando o que mostra;</w:t>
-      </w:r>
-      <w:r>
-        <w:t xml:space="preserve"> </w:t>
-      </w:r>
-      <w:r>
-        <w:rPr>
-          <w:rStyle w:val="VerbatimChar"/>
-        </w:rPr>
-        <w:t xml:space="preserve">swagger.json</w:t>
-      </w:r>
-      <w:r>
-        <w:t xml:space="preserve"> </w:t>
-      </w:r>
-      <w:r>
-        <w:t xml:space="preserve">cobre todas as rotas. Guia:</w:t>
-      </w:r>
-      <w:r>
-        <w:t xml:space="preserve"> </w:t>
-      </w:r>
-      <w:r>
-        <w:rPr>
-          <w:rStyle w:val="VerbatimChar"/>
-        </w:rPr>
-        <w:t xml:space="preserve">docs/PAINEL_APRENDIZADO.md</w:t>
-      </w:r>
-      <w:r>
-        <w:t xml:space="preserve">. Testado de verdade: API do painel contra Docker, k3d (nós, pods, HPA, eventos, logs) e um Postgres descartável (modos SQL, burla</w:t>
-      </w:r>
-      <w:r>
-        <w:t xml:space="preserve"> </w:t>
-      </w:r>
-      <w:r>
-        <w:rPr>
-          <w:rStyle w:val="VerbatimChar"/>
-        </w:rPr>
-        <w:t xml:space="preserve">COMMIT; DROP</w:t>
-      </w:r>
-      <w:r>
-        <w:t xml:space="preserve">,</w:t>
-      </w:r>
-      <w:r>
-        <w:t xml:space="preserve"> </w:t>
-      </w:r>
-      <w:r>
-        <w:rPr>
-          <w:rStyle w:val="VerbatimChar"/>
-        </w:rPr>
-        <w:t xml:space="preserve">COPY</w:t>
-      </w:r>
-      <w:r>
-        <w:t xml:space="preserve"> </w:t>
-      </w:r>
-      <w:r>
-        <w:t xml:space="preserve">bloqueado, timeout); rotas novas do Swagger exercitadas contra o backend.</w:t>
-      </w:r>
-      <w:r>
-        <w:t xml:space="preserve"> </w:t>
-      </w:r>
-      <w:r>
-        <w:rPr>
-          <w:b/>
-          <w:bCs/>
-        </w:rPr>
         <w:t xml:space="preserve">Pendente:</w:t>
       </w:r>
       <w:r>
         <w:t xml:space="preserve"> </w:t>
       </w:r>
       <w:r>
-        <w:t xml:space="preserve">conferir as 4 telas no navegador (a extensão do Chrome estava desconectada), commit e PR, e rebuildar a imagem do frontend (</w:t>
-      </w:r>
-      <w:r>
-        <w:rPr>
-          <w:rStyle w:val="VerbatimChar"/>
-        </w:rPr>
-        <w:t xml:space="preserve">sh scripts/k8s/dev-deploy.sh frontend</w:t>
-      </w:r>
-      <w:r>
-        <w:t xml:space="preserve">) para o novo Swagger aparecer no cluster.</w:t>
+        <w:t xml:space="preserve">conferir as 4 telas do painel num navegador (a extensão do Chrome estava desconectada; só sintaxe, lint e ligação HTML↔JS foram checados). O Console SQL cobre só o banco do Compose, não o Postgres do cluster.</w:t>
       </w:r>
     </w:p>
     <w:p>

</xml_diff>

<commit_message>
fix(painel): menu do cabeçalho quebra linha no celular e favicon sem 404
Achados ao conferir as telas no navegador (Chrome headless):
- o menu estourava a largura em telas estreitas (647 px em 390);
- /favicon.ico respondia 404 e sujava o console.
STATUS atualizado com o resultado da conferência.

Co-Authored-By: Claude Sonnet 5.5 <noreply@anthropic.com>
</commit_message>
<xml_diff>
--- a/docs/STATUS_LABORATORIO.docx
+++ b/docs/STATUS_LABORATORIO.docx
@@ -4998,13 +4998,53 @@
           <w:b/>
           <w:bCs/>
         </w:rPr>
-        <w:t xml:space="preserve">Pendente:</w:t>
-      </w:r>
-      <w:r>
-        <w:t xml:space="preserve"> </w:t>
-      </w:r>
-      <w:r>
-        <w:t xml:space="preserve">conferir as 4 telas do painel num navegador (a extensão do Chrome estava desconectada; só sintaxe, lint e ligação HTML↔JS foram checados). O Console SQL cobre só o banco do Compose, não o Postgres do cluster.</w:t>
+        <w:t xml:space="preserve">Telas conferidas no navegador</w:t>
+      </w:r>
+      <w:r>
+        <w:t xml:space="preserve"> </w:t>
+      </w:r>
+      <w:r>
+        <w:t xml:space="preserve">(Chrome headless via CDP, com a extensão do Chrome desconectada): as 4 renderizam com dados reais (Docker, k3d e um Postgres descartável), logs, troca de namespace e os 3 modos do Console SQL funcionam (senha oculta, simular não grava, gravar exige confirmação). Achados e corrigidos no PR seguinte: menu do cabeçalho estourava a largura no celular (647 px em 390) e</w:t>
+      </w:r>
+      <w:r>
+        <w:t xml:space="preserve"> </w:t>
+      </w:r>
+      <w:r>
+        <w:rPr>
+          <w:rStyle w:val="VerbatimChar"/>
+        </w:rPr>
+        <w:t xml:space="preserve">favicon.ico</w:t>
+      </w:r>
+      <w:r>
+        <w:t xml:space="preserve"> </w:t>
+      </w:r>
+      <w:r>
+        <w:t xml:space="preserve">dava 404. O Console SQL cobre só o banco do Compose, não o Postgres do cluster.</w:t>
+      </w:r>
+      <w:r>
+        <w:t xml:space="preserve"> </w:t>
+      </w:r>
+      <w:r>
+        <w:rPr>
+          <w:b/>
+          <w:bCs/>
+        </w:rPr>
+        <w:t xml:space="preserve">Fora do escopo, para depois:</w:t>
+      </w:r>
+      <w:r>
+        <w:t xml:space="preserve"> </w:t>
+      </w:r>
+      <w:r>
+        <w:t xml:space="preserve">o cabeçalho do próprio LabSystem (</w:t>
+      </w:r>
+      <w:r>
+        <w:rPr>
+          <w:rStyle w:val="VerbatimChar"/>
+        </w:rPr>
+        <w:t xml:space="preserve">src/public/css/styles.css</w:t>
+      </w:r>
+      <w:r>
+        <w:t xml:space="preserve">, altura fixa e menu sem quebra de linha) também estoura a largura no celular.</w:t>
       </w:r>
     </w:p>
     <w:p>

</xml_diff>